<commit_message>
vista de facturacion para MEG
</commit_message>
<xml_diff>
--- a/Documentacion/Intranet_Notas de versión.docx
+++ b/Documentacion/Intranet_Notas de versión.docx
@@ -258,19 +258,11 @@
           <w:lang w:val="es-ES"/>
         </w:rPr>
       </w:pPr>
-      <w:proofErr w:type="gramStart"/>
-      <w:r>
-        <w:rPr>
-          <w:lang w:val="es-ES"/>
-        </w:rPr>
-        <w:t>Archivo a modificar</w:t>
-      </w:r>
-      <w:proofErr w:type="gramEnd"/>
-      <w:r>
-        <w:rPr>
-          <w:lang w:val="es-ES"/>
-        </w:rPr>
-        <w:t xml:space="preserve">: Página </w:t>
+      <w:r>
+        <w:rPr>
+          <w:lang w:val="es-ES"/>
+        </w:rPr>
+        <w:t xml:space="preserve">Archivo a modificar: Página </w:t>
       </w:r>
       <w:r>
         <w:rPr>
@@ -642,19 +634,7 @@
         <w:rPr>
           <w:lang w:val="es-ES"/>
         </w:rPr>
-        <w:t>Versión: 2.0.1.</w:t>
-      </w:r>
-      <w:r>
-        <w:rPr>
-          <w:lang w:val="es-ES"/>
-        </w:rPr>
-        <w:t>27</w:t>
-      </w:r>
-      <w:r>
-        <w:rPr>
-          <w:lang w:val="es-ES"/>
-        </w:rPr>
-        <w:t>0526</w:t>
+        <w:t>Versión: 2.0.1.270526</w:t>
       </w:r>
     </w:p>
     <w:p>
@@ -680,45 +660,7 @@
         <w:rPr>
           <w:lang w:val="es-ES"/>
         </w:rPr>
-        <w:t xml:space="preserve">Cambio realizado en el </w:t>
-      </w:r>
-      <w:proofErr w:type="spellStart"/>
-      <w:r>
-        <w:rPr>
-          <w:lang w:val="es-ES"/>
-        </w:rPr>
-        <w:t>footer</w:t>
-      </w:r>
-      <w:proofErr w:type="spellEnd"/>
-      <w:r>
-        <w:rPr>
-          <w:lang w:val="es-ES"/>
-        </w:rPr>
-        <w:t xml:space="preserve"> del sistema</w:t>
-      </w:r>
-      <w:r>
-        <w:rPr>
-          <w:lang w:val="es-ES"/>
-        </w:rPr>
-        <w:t xml:space="preserve"> a pedido de </w:t>
-      </w:r>
-      <w:r>
-        <w:rPr>
-          <w:lang w:val="es-ES"/>
-        </w:rPr>
-        <w:t>German Aguirre</w:t>
-      </w:r>
-      <w:r>
-        <w:rPr>
-          <w:lang w:val="es-ES"/>
-        </w:rPr>
-        <w:t xml:space="preserve">. </w:t>
-      </w:r>
-      <w:r>
-        <w:rPr>
-          <w:lang w:val="es-ES"/>
-        </w:rPr>
-        <w:t>El objetivo es poder cambiar su versionado según criterio de los cambios realizados en el sistema Intranet.</w:t>
+        <w:t>Cambio realizado en el footer del sistema a pedido de German Aguirre. El objetivo es poder cambiar su versionado según criterio de los cambios realizados en el sistema Intranet.</w:t>
       </w:r>
     </w:p>
     <w:p>
@@ -774,34 +716,12 @@
           <w:lang w:val="es-ES"/>
         </w:rPr>
       </w:pPr>
-      <w:proofErr w:type="gramStart"/>
-      <w:r>
-        <w:rPr>
-          <w:lang w:val="es-ES"/>
-        </w:rPr>
-        <w:t>Archivo a modificar</w:t>
-      </w:r>
-      <w:proofErr w:type="gramEnd"/>
-      <w:r>
-        <w:rPr>
-          <w:lang w:val="es-ES"/>
-        </w:rPr>
-        <w:t>:</w:t>
-      </w:r>
-      <w:r>
-        <w:rPr>
-          <w:lang w:val="es-ES"/>
-        </w:rPr>
-        <w:t xml:space="preserve"> </w:t>
-      </w:r>
-      <w:proofErr w:type="spellStart"/>
-      <w:r>
-        <w:rPr>
-          <w:lang w:val="es-ES"/>
-        </w:rPr>
-        <w:t>AssemblyInfo.cs</w:t>
-      </w:r>
-      <w:proofErr w:type="spellEnd"/>
+      <w:r>
+        <w:rPr>
+          <w:lang w:val="es-ES"/>
+        </w:rPr>
+        <w:t>Archivo a modificar: AssemblyInfo.cs</w:t>
+      </w:r>
     </w:p>
     <w:p>
       <w:pPr>
@@ -819,16 +739,8 @@
         <w:rPr>
           <w:lang w:val="es-ES"/>
         </w:rPr>
-        <w:t>Intranet/</w:t>
-      </w:r>
-      <w:proofErr w:type="spellStart"/>
-      <w:r>
-        <w:rPr>
-          <w:lang w:val="es-ES"/>
-        </w:rPr>
-        <w:t>Properties</w:t>
-      </w:r>
-      <w:proofErr w:type="spellEnd"/>
+        <w:t>Intranet/Properties</w:t>
+      </w:r>
     </w:p>
     <w:p>
       <w:pPr>
@@ -902,19 +814,11 @@
           <w:lang w:val="es-ES"/>
         </w:rPr>
       </w:pPr>
-      <w:proofErr w:type="spellStart"/>
-      <w:r>
-        <w:rPr>
-          <w:lang w:val="es-ES"/>
-        </w:rPr>
-        <w:t>Linea</w:t>
-      </w:r>
-      <w:proofErr w:type="spellEnd"/>
-      <w:r>
-        <w:rPr>
-          <w:lang w:val="es-ES"/>
-        </w:rPr>
-        <w:t xml:space="preserve"> 35 aquí es donde se puede modificar la versión a la cual se ha hecho alguna modificación donde se debe cambiar según criterio por ejemplo el primer digito es para cambios muy importantes tanto como diseño y también con respeto a lógica y funcionalidades importantes. El segundo digito podría ser para un cambio importante </w:t>
+      <w:r>
+        <w:rPr>
+          <w:lang w:val="es-ES"/>
+        </w:rPr>
+        <w:t xml:space="preserve">Linea 35 aquí es donde se puede modificar la versión a la cual se ha hecho alguna modificación donde se debe cambiar según criterio por ejemplo el primer digito es para cambios muy importantes tanto como diseño y también con respeto a lógica y funcionalidades importantes. El segundo digito podría ser para un cambio importante </w:t>
       </w:r>
       <w:r>
         <w:rPr>
@@ -948,55 +852,7 @@
         <w:rPr>
           <w:highlight w:val="yellow"/>
         </w:rPr>
-        <w:t>[</w:t>
-      </w:r>
-      <w:proofErr w:type="spellStart"/>
-      <w:r>
-        <w:rPr>
-          <w:highlight w:val="yellow"/>
-        </w:rPr>
-        <w:t>assembly</w:t>
-      </w:r>
-      <w:proofErr w:type="spellEnd"/>
-      <w:r>
-        <w:rPr>
-          <w:highlight w:val="yellow"/>
-        </w:rPr>
-        <w:t xml:space="preserve">: </w:t>
-      </w:r>
-      <w:proofErr w:type="spellStart"/>
-      <w:proofErr w:type="gramStart"/>
-      <w:r>
-        <w:rPr>
-          <w:highlight w:val="yellow"/>
-        </w:rPr>
-        <w:t>AssemblyFileVersion</w:t>
-      </w:r>
-      <w:proofErr w:type="spellEnd"/>
-      <w:r>
-        <w:rPr>
-          <w:highlight w:val="yellow"/>
-        </w:rPr>
-        <w:t>(</w:t>
-      </w:r>
-      <w:proofErr w:type="gramEnd"/>
-      <w:r>
-        <w:rPr>
-          <w:highlight w:val="yellow"/>
-        </w:rPr>
-        <w:t>"2.0.1.</w:t>
-      </w:r>
-      <w:r>
-        <w:rPr>
-          <w:highlight w:val="yellow"/>
-        </w:rPr>
-        <w:t>240101</w:t>
-      </w:r>
-      <w:r>
-        <w:rPr>
-          <w:highlight w:val="yellow"/>
-        </w:rPr>
-        <w:t>")]</w:t>
+        <w:t>[assembly: AssemblyFileVersion("2.0.1.240101")]</w:t>
       </w:r>
     </w:p>
     <w:p/>
@@ -1006,34 +862,12 @@
           <w:lang w:val="es-ES"/>
         </w:rPr>
       </w:pPr>
-      <w:proofErr w:type="gramStart"/>
-      <w:r>
-        <w:rPr>
-          <w:lang w:val="es-ES"/>
-        </w:rPr>
-        <w:t>Archivo a modificar</w:t>
-      </w:r>
-      <w:proofErr w:type="gramEnd"/>
-      <w:r>
-        <w:rPr>
-          <w:lang w:val="es-ES"/>
-        </w:rPr>
-        <w:t>:</w:t>
-      </w:r>
-      <w:r>
-        <w:rPr>
-          <w:lang w:val="es-ES"/>
-        </w:rPr>
-        <w:t xml:space="preserve"> </w:t>
-      </w:r>
-      <w:proofErr w:type="spellStart"/>
-      <w:r>
-        <w:rPr>
-          <w:lang w:val="es-ES"/>
-        </w:rPr>
-        <w:t>Main.Master.cs</w:t>
-      </w:r>
-      <w:proofErr w:type="spellEnd"/>
+      <w:r>
+        <w:rPr>
+          <w:lang w:val="es-ES"/>
+        </w:rPr>
+        <w:t>Archivo a modificar: Main.Master.cs</w:t>
+      </w:r>
     </w:p>
     <w:p>
       <w:pPr>
@@ -1116,147 +950,470 @@
       </w:r>
     </w:p>
     <w:p>
-      <w:proofErr w:type="spellStart"/>
-      <w:r>
-        <w:t>string</w:t>
-      </w:r>
-      <w:proofErr w:type="spellEnd"/>
-      <w:r>
+      <w:pPr>
+        <w:rPr>
+          <w:lang w:val="en-US"/>
+        </w:rPr>
+      </w:pPr>
+      <w:r>
+        <w:rPr>
+          <w:lang w:val="en-US"/>
+        </w:rPr>
+        <w:t>string fileVersion = System.Reflection.Assembly.GetExecutingAssembly()</w:t>
+      </w:r>
+    </w:p>
+    <w:p>
+      <w:pPr>
+        <w:rPr>
+          <w:lang w:val="en-US"/>
+        </w:rPr>
+      </w:pPr>
+      <w:r>
+        <w:rPr>
+          <w:lang w:val="en-US"/>
+        </w:rPr>
+        <w:t xml:space="preserve">               .GetCustomAttribute&lt;System.Reflection.AssemblyFileVersionAttribute&gt;()?</w:t>
+      </w:r>
+    </w:p>
+    <w:p>
+      <w:pPr>
+        <w:rPr>
+          <w:lang w:val="en-US"/>
+        </w:rPr>
+      </w:pPr>
+      <w:r>
+        <w:rPr>
+          <w:lang w:val="en-US"/>
+        </w:rPr>
+        <w:t xml:space="preserve">               .Version;</w:t>
+      </w:r>
+    </w:p>
+    <w:p>
+      <w:pPr>
+        <w:rPr>
+          <w:lang w:val="en-US"/>
+        </w:rPr>
+      </w:pPr>
+      <w:r>
+        <w:rPr>
+          <w:lang w:val="en-US"/>
+        </w:rPr>
+        <w:t>Label3.Text = fileVersion;</w:t>
+      </w:r>
+    </w:p>
+    <w:p>
+      <w:pPr>
+        <w:rPr>
+          <w:lang w:val="en-US"/>
+        </w:rPr>
+      </w:pPr>
+    </w:p>
+    <w:p>
+      <w:pPr>
+        <w:rPr>
+          <w:lang w:val="en-US"/>
+        </w:rPr>
+      </w:pPr>
+      <w:r>
+        <w:rPr>
+          <w:lang w:val="en-US"/>
+        </w:rPr>
+        <w:t>Esto permite poder tomar los valores del archivo AssemblyInfo.cs de la línea 35:</w:t>
+      </w:r>
+    </w:p>
+    <w:p>
+      <w:pPr>
+        <w:rPr>
+          <w:lang w:val="es-ES"/>
+        </w:rPr>
+      </w:pPr>
+      <w:r>
+        <w:t>[assembly: AssemblyFileVersion("2.0.1.270525")]</w:t>
+      </w:r>
+    </w:p>
+    <w:p>
+      <w:pPr>
+        <w:rPr>
+          <w:lang w:val="es-ES"/>
+        </w:rPr>
+      </w:pPr>
+    </w:p>
+    <w:p>
+      <w:pPr>
+        <w:rPr>
+          <w:lang w:val="es-ES"/>
+        </w:rPr>
+      </w:pPr>
+      <w:r>
+        <w:rPr>
+          <w:lang w:val="es-ES"/>
+        </w:rPr>
+        <w:br w:type="page"/>
+      </w:r>
+    </w:p>
+    <w:p>
+      <w:pPr>
+        <w:rPr>
+          <w:lang w:val="es-ES"/>
+        </w:rPr>
+      </w:pPr>
+      <w:r>
+        <w:rPr>
+          <w:lang w:val="es-ES"/>
+        </w:rPr>
+        <w:lastRenderedPageBreak/>
+        <w:t>Aplicación: Intranet</w:t>
+      </w:r>
+    </w:p>
+    <w:p>
+      <w:pPr>
+        <w:rPr>
+          <w:lang w:val="es-ES"/>
+        </w:rPr>
+      </w:pPr>
+      <w:r>
+        <w:rPr>
+          <w:lang w:val="es-ES"/>
+        </w:rPr>
+        <w:t>Fecha: 08/07/2025</w:t>
+      </w:r>
+    </w:p>
+    <w:p>
+      <w:pPr>
+        <w:rPr>
+          <w:lang w:val="es-ES"/>
+        </w:rPr>
+      </w:pPr>
+      <w:r>
+        <w:rPr>
+          <w:lang w:val="es-ES"/>
+        </w:rPr>
+        <w:t>Versión: 2.0.2.0 (a definir)</w:t>
+      </w:r>
+    </w:p>
+    <w:p>
+      <w:pPr>
+        <w:rPr>
+          <w:lang w:val="es-ES"/>
+        </w:rPr>
+      </w:pPr>
+      <w:r>
+        <w:rPr>
+          <w:lang w:val="es-ES"/>
+        </w:rPr>
+        <w:t>Resumen</w:t>
+      </w:r>
+    </w:p>
+    <w:p>
+      <w:pPr>
+        <w:rPr>
+          <w:lang w:val="es-ES"/>
+        </w:rPr>
+      </w:pPr>
+      <w:r>
+        <w:rPr>
+          <w:lang w:val="es-ES"/>
+        </w:rPr>
+        <w:t xml:space="preserve">Cambio realizado en el apartado del área Comercial a pedido de María Eugenia González. </w:t>
+      </w:r>
+      <w:r>
+        <w:rPr>
+          <w:lang w:val="es-ES"/>
+        </w:rPr>
+        <w:t>Se agregó vínculo de acceso al Tablero de Gerencia al usuario para que pueda visualizar los datos de facturación</w:t>
+      </w:r>
+      <w:r>
+        <w:rPr>
+          <w:lang w:val="es-ES"/>
+        </w:rPr>
+        <w:t xml:space="preserve"> con autorización de Ariel Broide.</w:t>
+      </w:r>
+    </w:p>
+    <w:p>
+      <w:pPr>
+        <w:rPr>
+          <w:lang w:val="es-ES"/>
+        </w:rPr>
+      </w:pPr>
+      <w:r>
+        <w:rPr>
+          <w:lang w:val="es-ES"/>
+        </w:rPr>
+        <w:t xml:space="preserve">Para ello, </w:t>
+      </w:r>
+      <w:r>
+        <w:rPr>
+          <w:lang w:val="es-ES"/>
+        </w:rPr>
+        <w:t xml:space="preserve">en el menú comercial, submenú Administración de Ventas, se agregó </w:t>
+      </w:r>
+      <w:r>
+        <w:rPr>
+          <w:lang w:val="es-ES"/>
+        </w:rPr>
+        <w:t xml:space="preserve">label </w:t>
+      </w:r>
+      <w:r>
+        <w:rPr>
+          <w:b/>
+          <w:bCs/>
+          <w:lang w:val="es-ES"/>
+        </w:rPr>
+        <w:t>Vista Facturación</w:t>
+      </w:r>
+      <w:r>
+        <w:rPr>
+          <w:lang w:val="es-ES"/>
+        </w:rPr>
+        <w:t xml:space="preserve"> con hipervínculo a página del Tablero en cuestión.</w:t>
+      </w:r>
+      <w:r>
+        <w:rPr>
+          <w:lang w:val="es-ES"/>
+        </w:rPr>
         <w:t xml:space="preserve"> </w:t>
       </w:r>
-      <w:proofErr w:type="spellStart"/>
-      <w:r>
-        <w:t>fileVersion</w:t>
-      </w:r>
-      <w:proofErr w:type="spellEnd"/>
-      <w:r>
-        <w:t xml:space="preserve"> = </w:t>
-      </w:r>
-      <w:proofErr w:type="spellStart"/>
-      <w:proofErr w:type="gramStart"/>
-      <w:r>
-        <w:t>System.Reflection.Assembly.GetExecutingAssembly</w:t>
-      </w:r>
-      <w:proofErr w:type="spellEnd"/>
-      <w:proofErr w:type="gramEnd"/>
-      <w:r>
-        <w:t>()</w:t>
-      </w:r>
-    </w:p>
-    <w:p>
-      <w:r>
-        <w:t xml:space="preserve">               </w:t>
-      </w:r>
-      <w:proofErr w:type="gramStart"/>
-      <w:r>
-        <w:t>.GetCustomAttribute&lt;System.Reflection</w:t>
-      </w:r>
-      <w:proofErr w:type="gramEnd"/>
-      <w:r>
-        <w:t>.AssemblyFileVersionAttribute</w:t>
-      </w:r>
-      <w:proofErr w:type="gramStart"/>
-      <w:r>
-        <w:t>&gt;(</w:t>
-      </w:r>
-      <w:proofErr w:type="gramEnd"/>
-      <w:r>
-        <w:t>)?</w:t>
-      </w:r>
-    </w:p>
-    <w:p>
-      <w:r>
-        <w:t xml:space="preserve">               </w:t>
-      </w:r>
-      <w:proofErr w:type="gramStart"/>
-      <w:r>
+    </w:p>
+    <w:p>
+      <w:pPr>
+        <w:rPr>
+          <w:lang w:val="es-ES"/>
+        </w:rPr>
+      </w:pPr>
+      <w:r>
+        <w:rPr>
+          <w:noProof/>
+        </w:rPr>
+        <w:drawing>
+          <wp:inline distT="0" distB="0" distL="0" distR="0" wp14:anchorId="580DBF16" wp14:editId="75B3A44B">
+            <wp:extent cx="5295900" cy="3083435"/>
+            <wp:effectExtent l="0" t="0" r="0" b="3175"/>
+            <wp:docPr id="567891330" name="Imagen 1" descr="Interfaz de usuario gráfica, Sitio web&#10;&#10;El contenido generado por IA puede ser incorrecto."/>
+            <wp:cNvGraphicFramePr>
+              <a:graphicFrameLocks xmlns:a="http://schemas.openxmlformats.org/drawingml/2006/main" noChangeAspect="1"/>
+            </wp:cNvGraphicFramePr>
+            <a:graphic xmlns:a="http://schemas.openxmlformats.org/drawingml/2006/main">
+              <a:graphicData uri="http://schemas.openxmlformats.org/drawingml/2006/picture">
+                <pic:pic xmlns:pic="http://schemas.openxmlformats.org/drawingml/2006/picture">
+                  <pic:nvPicPr>
+                    <pic:cNvPr id="567891330" name="Imagen 1" descr="Interfaz de usuario gráfica, Sitio web&#10;&#10;El contenido generado por IA puede ser incorrecto."/>
+                    <pic:cNvPicPr/>
+                  </pic:nvPicPr>
+                  <pic:blipFill rotWithShape="1">
+                    <a:blip r:embed="rId11"/>
+                    <a:srcRect l="12841" t="13545" r="12512" b="9197"/>
+                    <a:stretch>
+                      <a:fillRect/>
+                    </a:stretch>
+                  </pic:blipFill>
+                  <pic:spPr bwMode="auto">
+                    <a:xfrm>
+                      <a:off x="0" y="0"/>
+                      <a:ext cx="5310441" cy="3091901"/>
+                    </a:xfrm>
+                    <a:prstGeom prst="rect">
+                      <a:avLst/>
+                    </a:prstGeom>
+                    <a:ln>
+                      <a:noFill/>
+                    </a:ln>
+                    <a:extLst>
+                      <a:ext uri="{53640926-AAD7-44D8-BBD7-CCE9431645EC}">
+                        <a14:shadowObscured xmlns:a14="http://schemas.microsoft.com/office/drawing/2010/main"/>
+                      </a:ext>
+                    </a:extLst>
+                  </pic:spPr>
+                </pic:pic>
+              </a:graphicData>
+            </a:graphic>
+          </wp:inline>
+        </w:drawing>
+      </w:r>
+    </w:p>
+    <w:p>
+      <w:pPr>
+        <w:rPr>
+          <w:b/>
+          <w:bCs/>
+          <w:lang w:val="es-ES"/>
+        </w:rPr>
+      </w:pPr>
+      <w:r>
+        <w:rPr>
+          <w:lang w:val="es-ES"/>
+        </w:rPr>
+        <w:t xml:space="preserve">Archivo a modificar: </w:t>
+      </w:r>
+      <w:r>
+        <w:rPr>
+          <w:b/>
+          <w:bCs/>
+          <w:lang w:val="es-ES"/>
+        </w:rPr>
+        <w:t>Main.Master</w:t>
+      </w:r>
+    </w:p>
+    <w:p>
+      <w:pPr>
+        <w:rPr>
+          <w:lang w:val="es-ES"/>
+        </w:rPr>
+      </w:pPr>
+      <w:r>
+        <w:rPr>
+          <w:lang w:val="es-ES"/>
+        </w:rPr>
+        <w:t xml:space="preserve">Buscar el apartado de los menúes y allí ubicar </w:t>
+      </w:r>
+      <w:r>
+        <w:rPr>
+          <w:lang w:val="es-ES"/>
+        </w:rPr>
+        <w:t>el submenú</w:t>
+      </w:r>
+      <w:r>
+        <w:rPr>
+          <w:lang w:val="es-ES"/>
+        </w:rPr>
+        <w:t xml:space="preserve"> en cuestión. En este caso, </w:t>
+      </w:r>
+      <w:r>
+        <w:rPr>
+          <w:lang w:val="es-ES"/>
+        </w:rPr>
+        <w:t xml:space="preserve">a partir de la </w:t>
+      </w:r>
+      <w:r>
+        <w:rPr>
+          <w:lang w:val="es-ES"/>
+        </w:rPr>
+        <w:t xml:space="preserve">línea </w:t>
+      </w:r>
+      <w:r>
+        <w:rPr>
+          <w:lang w:val="es-ES"/>
+        </w:rPr>
+        <w:t>355</w:t>
+      </w:r>
+      <w:r>
+        <w:rPr>
+          <w:lang w:val="es-ES"/>
+        </w:rPr>
         <w:t>.</w:t>
       </w:r>
-      <w:proofErr w:type="spellStart"/>
-      <w:r>
-        <w:t>Version</w:t>
-      </w:r>
-      <w:proofErr w:type="spellEnd"/>
-      <w:proofErr w:type="gramEnd"/>
-      <w:r>
-        <w:t>;</w:t>
-      </w:r>
-    </w:p>
-    <w:p>
-      <w:r>
-        <w:t xml:space="preserve">Label3.Text = </w:t>
-      </w:r>
-      <w:proofErr w:type="spellStart"/>
-      <w:r>
-        <w:t>fileVersion</w:t>
-      </w:r>
-      <w:proofErr w:type="spellEnd"/>
-      <w:r>
-        <w:t>;</w:t>
-      </w:r>
-    </w:p>
-    <w:p/>
-    <w:p>
-      <w:pPr>
-        <w:rPr>
-          <w:lang w:val="es-ES"/>
-        </w:rPr>
-      </w:pPr>
-      <w:r>
-        <w:t xml:space="preserve">Esto permite poder tomar los valores del archivo </w:t>
-      </w:r>
-      <w:proofErr w:type="spellStart"/>
-      <w:r>
-        <w:rPr>
-          <w:lang w:val="es-ES"/>
-        </w:rPr>
-        <w:t>AssemblyInfo.cs</w:t>
-      </w:r>
-      <w:proofErr w:type="spellEnd"/>
-      <w:r>
-        <w:rPr>
-          <w:lang w:val="es-ES"/>
-        </w:rPr>
-        <w:t xml:space="preserve"> de la línea 35:</w:t>
-      </w:r>
-    </w:p>
-    <w:p>
-      <w:pPr>
-        <w:rPr>
-          <w:lang w:val="es-ES"/>
-        </w:rPr>
-      </w:pPr>
-      <w:r>
-        <w:t>[</w:t>
-      </w:r>
-      <w:proofErr w:type="spellStart"/>
-      <w:r>
-        <w:t>assembly</w:t>
-      </w:r>
-      <w:proofErr w:type="spellEnd"/>
-      <w:r>
-        <w:t xml:space="preserve">: </w:t>
-      </w:r>
-      <w:proofErr w:type="spellStart"/>
-      <w:proofErr w:type="gramStart"/>
-      <w:r>
-        <w:t>AssemblyFileVersion</w:t>
-      </w:r>
-      <w:proofErr w:type="spellEnd"/>
-      <w:r>
-        <w:t>(</w:t>
-      </w:r>
-      <w:proofErr w:type="gramEnd"/>
-      <w:r>
-        <w:t>"2.0.1.270525")]</w:t>
-      </w:r>
-    </w:p>
-    <w:p>
-      <w:pPr>
-        <w:rPr>
-          <w:lang w:val="es-ES"/>
-        </w:rPr>
-      </w:pPr>
+    </w:p>
+    <w:p>
+      <w:pPr>
+        <w:rPr>
+          <w:lang w:val="es-ES"/>
+        </w:rPr>
+      </w:pPr>
+      <w:r>
+        <w:rPr>
+          <w:lang w:val="es-ES"/>
+        </w:rPr>
+        <w:t>Se agregó u</w:t>
+      </w:r>
+      <w:r>
+        <w:rPr>
+          <w:lang w:val="es-ES"/>
+        </w:rPr>
+        <w:t>na línea (</w:t>
+      </w:r>
+      <w:r>
+        <w:rPr>
+          <w:lang w:val="es-ES"/>
+        </w:rPr>
+        <w:t>377) en</w:t>
+      </w:r>
+      <w:r>
+        <w:rPr>
+          <w:lang w:val="es-ES"/>
+        </w:rPr>
+        <w:t xml:space="preserve"> referencia a la página con leyenda “Vista Facturación”</w:t>
+      </w:r>
+    </w:p>
+    <w:p>
+      <w:pPr>
+        <w:rPr>
+          <w:lang w:val="es-ES"/>
+        </w:rPr>
+      </w:pPr>
+      <w:r>
+        <w:rPr>
+          <w:noProof/>
+        </w:rPr>
+        <w:drawing>
+          <wp:inline distT="0" distB="0" distL="0" distR="0" wp14:anchorId="5409638F" wp14:editId="52C75F06">
+            <wp:extent cx="5295900" cy="2310363"/>
+            <wp:effectExtent l="0" t="0" r="0" b="0"/>
+            <wp:docPr id="1395099597" name="Imagen 1"/>
+            <wp:cNvGraphicFramePr>
+              <a:graphicFrameLocks xmlns:a="http://schemas.openxmlformats.org/drawingml/2006/main" noChangeAspect="1"/>
+            </wp:cNvGraphicFramePr>
+            <a:graphic xmlns:a="http://schemas.openxmlformats.org/drawingml/2006/main">
+              <a:graphicData uri="http://schemas.openxmlformats.org/drawingml/2006/picture">
+                <pic:pic xmlns:pic="http://schemas.openxmlformats.org/drawingml/2006/picture">
+                  <pic:nvPicPr>
+                    <pic:cNvPr id="1395099597" name=""/>
+                    <pic:cNvPicPr/>
+                  </pic:nvPicPr>
+                  <pic:blipFill rotWithShape="1">
+                    <a:blip r:embed="rId12"/>
+                    <a:srcRect l="3104" t="10034" r="26058" b="35034"/>
+                    <a:stretch>
+                      <a:fillRect/>
+                    </a:stretch>
+                  </pic:blipFill>
+                  <pic:spPr bwMode="auto">
+                    <a:xfrm>
+                      <a:off x="0" y="0"/>
+                      <a:ext cx="5310989" cy="2316946"/>
+                    </a:xfrm>
+                    <a:prstGeom prst="rect">
+                      <a:avLst/>
+                    </a:prstGeom>
+                    <a:ln>
+                      <a:noFill/>
+                    </a:ln>
+                    <a:extLst>
+                      <a:ext uri="{53640926-AAD7-44D8-BBD7-CCE9431645EC}">
+                        <a14:shadowObscured xmlns:a14="http://schemas.microsoft.com/office/drawing/2010/main"/>
+                      </a:ext>
+                    </a:extLst>
+                  </pic:spPr>
+                </pic:pic>
+              </a:graphicData>
+            </a:graphic>
+          </wp:inline>
+        </w:drawing>
+      </w:r>
+    </w:p>
+    <w:p>
+      <w:pPr>
+        <w:rPr>
+          <w:lang w:val="es-ES"/>
+        </w:rPr>
+      </w:pPr>
+      <w:r>
+        <w:rPr>
+          <w:lang w:val="es-ES"/>
+        </w:rPr>
+        <w:lastRenderedPageBreak/>
+        <w:t>Además, para que el user pueda visualizarlo, se lo agregó al grupo W_DIRECCION</w:t>
+      </w:r>
+      <w:r>
+        <w:rPr>
+          <w:lang w:val="es-ES"/>
+        </w:rPr>
+        <w:t xml:space="preserve"> (La idea es, una vez que podamos modificar el backend, </w:t>
+      </w:r>
+      <w:r>
+        <w:rPr>
+          <w:lang w:val="es-ES"/>
+        </w:rPr>
+        <w:t>crear un nuevo grupo y allí colocar los nuevos usuarios que necesiten acceso a esta info y agregar dicho grupo en el código del backend)</w:t>
+      </w:r>
     </w:p>
     <w:sectPr>
       <w:pgSz w:w="11906" w:h="16838"/>
@@ -1668,6 +1825,7 @@
   <w:style w:type="paragraph" w:default="1" w:styleId="Normal">
     <w:name w:val="Normal"/>
     <w:qFormat/>
+    <w:rsid w:val="0055301C"/>
   </w:style>
   <w:style w:type="paragraph" w:styleId="Ttulo1">
     <w:name w:val="heading 1"/>
@@ -1871,6 +2029,7 @@
   <w:style w:type="character" w:default="1" w:styleId="Fuentedeprrafopredeter">
     <w:name w:val="Default Paragraph Font"/>
     <w:uiPriority w:val="1"/>
+    <w:semiHidden/>
     <w:unhideWhenUsed/>
   </w:style>
   <w:style w:type="table" w:default="1" w:styleId="Tablanormal">

</xml_diff>